<commit_message>
fix(applications): tighten wording in 4 resumes to reduce implementation stretch risk
</commit_message>
<xml_diff>
--- a/04_Applications/Connecteam/resume/Resume.docx
+++ b/04_Applications/Connecteam/resume/Resume.docx
@@ -222,7 +222,7 @@
           <w:rFonts w:ascii="Arial" w:hAnsi="Arial"/>
           <w:sz w:val="17"/>
         </w:rPr>
-        <w:t>• Serve as the main point of contact for external customers across 150+ managed properties, ensuring client success and satisfaction through various communication channels.</w:t>
+        <w:t>• Provide remote technical troubleshooting for external customers across 150+ managed properties, effectively resolving hardware and connectivity issues.</w:t>
       </w:r>
     </w:p>
     <w:p>
@@ -261,7 +261,7 @@
           <w:rFonts w:ascii="Arial" w:hAnsi="Arial"/>
           <w:sz w:val="17"/>
         </w:rPr>
-        <w:t>• Provide positive, high-energy written and verbal communication to non-technical users to educate them on diagnostic steps and resolve day-to-day problems.</w:t>
+        <w:t>• Maintain positive, high-energy written and verbal communication with non-technical users to explain diagnostic steps and resolve day-to-day problems.</w:t>
       </w:r>
     </w:p>
     <w:p>

</xml_diff>